<commit_message>
Este es nuestro Sprint 0
</commit_message>
<xml_diff>
--- a/0.docx
+++ b/0.docx
@@ -626,7 +626,18 @@
               <w:rPr>
                 <w:rtl w:val="0"/>
               </w:rPr>
-              <w:t xml:space="preserve">Creado por: Su nombre</w:t>
+              <w:t xml:space="preserve">Soft Solution</w:t>
+            </w:r>
+          </w:p>
+          <w:p>
+            <w:pPr>
+              <w:rPr/>
+            </w:pPr>
+            <w:r>
+              <w:rPr>
+                <w:rtl w:val="0"/>
+              </w:rPr>
+              <w:t xml:space="preserve">Creado por: Elisa Hurtado, Alexander Rodriguez, Hector Aguiño</w:t>
             </w:r>
           </w:p>
           <w:p>
@@ -6265,28 +6276,28 @@
     <w:tbl>
       <w:tblPr>
         <w:tblStyle w:val="Table3"/>
-        <w:tblW w:w="15433.000000000002" w:type="dxa"/>
+        <w:tblW w:w="15810.0" w:type="dxa"/>
         <w:jc w:val="left"/>
         <w:tblLayout w:type="fixed"/>
         <w:tblLook w:val="04A0"/>
       </w:tblPr>
       <w:tblGrid>
-        <w:gridCol w:w="606"/>
-        <w:gridCol w:w="2513"/>
+        <w:gridCol w:w="600"/>
+        <w:gridCol w:w="2520"/>
         <w:gridCol w:w="2835"/>
-        <w:gridCol w:w="4394"/>
-        <w:gridCol w:w="1559"/>
-        <w:gridCol w:w="1418"/>
-        <w:gridCol w:w="2108"/>
+        <w:gridCol w:w="4395"/>
+        <w:gridCol w:w="1560"/>
+        <w:gridCol w:w="1425"/>
+        <w:gridCol w:w="2475"/>
         <w:tblGridChange w:id="0">
           <w:tblGrid>
-            <w:gridCol w:w="606"/>
-            <w:gridCol w:w="2513"/>
+            <w:gridCol w:w="600"/>
+            <w:gridCol w:w="2520"/>
             <w:gridCol w:w="2835"/>
-            <w:gridCol w:w="4394"/>
-            <w:gridCol w:w="1559"/>
-            <w:gridCol w:w="1418"/>
-            <w:gridCol w:w="2108"/>
+            <w:gridCol w:w="4395"/>
+            <w:gridCol w:w="1560"/>
+            <w:gridCol w:w="1425"/>
+            <w:gridCol w:w="2475"/>
           </w:tblGrid>
         </w:tblGridChange>
       </w:tblGrid>

</xml_diff>

<commit_message>
ESTA ES LA PARTE 2 DOCUMENTADA
</commit_message>
<xml_diff>
--- a/0.docx
+++ b/0.docx
@@ -626,18 +626,7 @@
               <w:rPr>
                 <w:rtl w:val="0"/>
               </w:rPr>
-              <w:t xml:space="preserve">Soft Solution</w:t>
-            </w:r>
-          </w:p>
-          <w:p>
-            <w:pPr>
-              <w:rPr/>
-            </w:pPr>
-            <w:r>
-              <w:rPr>
-                <w:rtl w:val="0"/>
-              </w:rPr>
-              <w:t xml:space="preserve">Creado por: Elisa Hurtado, Alexander Rodriguez, Hector Aguiño</w:t>
+              <w:t xml:space="preserve">Creado por: Su nombre</w:t>
             </w:r>
           </w:p>
           <w:p>
@@ -6276,28 +6265,28 @@
     <w:tbl>
       <w:tblPr>
         <w:tblStyle w:val="Table3"/>
-        <w:tblW w:w="15810.0" w:type="dxa"/>
+        <w:tblW w:w="15433.000000000002" w:type="dxa"/>
         <w:jc w:val="left"/>
         <w:tblLayout w:type="fixed"/>
         <w:tblLook w:val="04A0"/>
       </w:tblPr>
       <w:tblGrid>
-        <w:gridCol w:w="600"/>
-        <w:gridCol w:w="2520"/>
+        <w:gridCol w:w="606"/>
+        <w:gridCol w:w="2513"/>
         <w:gridCol w:w="2835"/>
-        <w:gridCol w:w="4395"/>
-        <w:gridCol w:w="1560"/>
-        <w:gridCol w:w="1425"/>
-        <w:gridCol w:w="2475"/>
+        <w:gridCol w:w="4394"/>
+        <w:gridCol w:w="1559"/>
+        <w:gridCol w:w="1418"/>
+        <w:gridCol w:w="2108"/>
         <w:tblGridChange w:id="0">
           <w:tblGrid>
-            <w:gridCol w:w="600"/>
-            <w:gridCol w:w="2520"/>
+            <w:gridCol w:w="606"/>
+            <w:gridCol w:w="2513"/>
             <w:gridCol w:w="2835"/>
-            <w:gridCol w:w="4395"/>
-            <w:gridCol w:w="1560"/>
-            <w:gridCol w:w="1425"/>
-            <w:gridCol w:w="2475"/>
+            <w:gridCol w:w="4394"/>
+            <w:gridCol w:w="1559"/>
+            <w:gridCol w:w="1418"/>
+            <w:gridCol w:w="2108"/>
           </w:tblGrid>
         </w:tblGridChange>
       </w:tblGrid>

</xml_diff>